<commit_message>
Lab1 finished, report updated added new docs files
</commit_message>
<xml_diff>
--- a/Отчеты/Лаб 1.docx
+++ b/Отчеты/Лаб 1.docx
@@ -553,26 +553,8 @@
     <w:p>
       <w:r>
         <w:t>•</w:t>
-      </w:r>
-      <w:r>
         <w:tab/>
-        <w:t xml:space="preserve">Реализовать </w:t>
-      </w:r>
-      <w:proofErr w:type="spellStart"/>
-      <w:r>
-        <w:t>Jupiter</w:t>
-      </w:r>
-      <w:proofErr w:type="spellEnd"/>
-      <w:r>
-        <w:t xml:space="preserve"> </w:t>
-      </w:r>
-      <w:proofErr w:type="spellStart"/>
-      <w:r>
-        <w:t>Notebook</w:t>
-      </w:r>
-      <w:proofErr w:type="spellEnd"/>
-      <w:r>
-        <w:t xml:space="preserve"> или консольное приложение для выполнения задания.</w:t>
+        <w:t>Реализовать консольное приложение на Python для выполнения задания.</w:t>
       </w:r>
     </w:p>
     <w:p>
@@ -2983,43 +2965,75 @@
         </w:rPr>
       </w:pPr>
       <w:r>
+        <w:t>Построены 2 гистограммы: распределение очков (points) и распределение стартовой позиции (grid). Гистограмма points показывает, что большинство записей имеют 0–1 очко, а высокие значения встречаются редко. Гистограмма grid показывает распределение стартовых позиций, с заметной концентрацией в середине стартовой решётки.</w:t>
+      </w:r>
+    </w:p>
+    <w:p>
+      <w:pPr>
+        <w:pStyle w:val="1"/>
+        <w:numPr>
+          <w:ilvl w:val="1"/>
+          <w:numId w:val="12"/>
+        </w:numPr>
         <w:rPr>
           <w:sz w:val="28"/>
           <w:szCs w:val="36"/>
         </w:rPr>
-        <w:t>Построены гистограммы для количественных признаков, таких как </w:t>
-      </w:r>
-      <w:proofErr w:type="spellStart"/>
-      <w:r>
+      </w:pPr>
+      <w:r>
+        <w:t>Выявлено, что распределение очков имеет правосторонний перекос, что указывает на то, что большинство гонщиков набирают небольшое количество очков, а лишь немногие получают высокие баллы.</w:t>
+      </w:r>
+    </w:p>
+    <w:p>
+      <w:pPr>
+        <w:pStyle w:val="1"/>
+        <w:numPr>
+          <w:ilvl w:val="0"/>
+          <w:numId w:val="12"/>
+        </w:numPr>
         <w:rPr>
           <w:sz w:val="28"/>
           <w:szCs w:val="36"/>
         </w:rPr>
-        <w:t>points</w:t>
-      </w:r>
-      <w:proofErr w:type="spellEnd"/>
+      </w:pPr>
       <w:r>
         <w:rPr>
           <w:sz w:val="28"/>
           <w:szCs w:val="36"/>
         </w:rPr>
-        <w:t> (очки, полученные гонщиком) и </w:t>
-      </w:r>
-      <w:proofErr w:type="spellStart"/>
-      <w:r>
+        <w:t>Многомерный анализ:</w:t>
+      </w:r>
+    </w:p>
+    <w:p>
+      <w:pPr>
+        <w:pStyle w:val="1"/>
+        <w:numPr>
+          <w:ilvl w:val="1"/>
+          <w:numId w:val="12"/>
+        </w:numPr>
         <w:rPr>
           <w:sz w:val="28"/>
           <w:szCs w:val="36"/>
         </w:rPr>
-        <w:t>grid</w:t>
-      </w:r>
-      <w:proofErr w:type="spellEnd"/>
-      <w:r>
+      </w:pPr>
+      <w:r>
+        <w:t>Построен многомерный scatter-график: по оси X — стартовая позиция (grid), по оси Y — финишная позиция (position), размер точки отражает очки (points), цвет — конструктор. График показывает связь стартовой и финишной позиции: чем выше старт, тем чаще высокий финиш, а большие очки чаще получают пилоты, стартующие в первой части решётки.</w:t>
+      </w:r>
+    </w:p>
+    <w:p>
+      <w:pPr>
+        <w:pStyle w:val="1"/>
+        <w:numPr>
+          <w:ilvl w:val="1"/>
+          <w:numId w:val="12"/>
+        </w:numPr>
         <w:rPr>
           <w:sz w:val="28"/>
           <w:szCs w:val="36"/>
         </w:rPr>
-        <w:t> (стартовая позиция). Гистограммы позволили визуализировать распределение данных и сделать выводы о том, как часто гонщики набирают определенное количество очков или стартуют с определенной позиции.</w:t>
+      </w:pPr>
+      <w:r>
+        <w:t>Дополнительно на графике видно, что у топовых конструкторов чаще встречаются более высокие значения очков.</w:t>
       </w:r>
     </w:p>
     <w:p>
@@ -3039,7 +3053,7 @@
           <w:sz w:val="28"/>
           <w:szCs w:val="36"/>
         </w:rPr>
-        <w:t>Выявлено, что распределение очков имеет правосторонний перекос, что указывает на то, что большинство гонщиков набирают небольшое количество очков, а лишь немногие получают высокие баллы. Распределение стартовых позиций более равномерное, но с небольшим смещением в сторону более высоких позиций.</w:t>
+        <w:t>На графиках видно, что стартовая позиция имеет значительное влияние на финишную позицию и количество набранных очков, что подтверждает важность квалификации в гонках Формулы 1.</w:t>
       </w:r>
     </w:p>
     <w:p>
@@ -3059,7 +3073,7 @@
           <w:sz w:val="28"/>
           <w:szCs w:val="36"/>
         </w:rPr>
-        <w:t>Многомерный анализ:</w:t>
+        <w:t>Объединение данных в одну таблицу:</w:t>
       </w:r>
     </w:p>
     <w:p>
@@ -3079,8 +3093,7 @@
           <w:sz w:val="28"/>
           <w:szCs w:val="36"/>
         </w:rPr>
-        <w:lastRenderedPageBreak/>
-        <w:t xml:space="preserve">Построены графики, объединяющие несколько признаков. Например, был создан </w:t>
+        <w:t>Для удобства анализа данные из нескольких таблиц были объединены в одну таблицу с использованием библиотеки </w:t>
       </w:r>
       <w:proofErr w:type="spellStart"/>
       <w:r>
@@ -3088,7 +3101,7 @@
           <w:sz w:val="28"/>
           <w:szCs w:val="36"/>
         </w:rPr>
-        <w:t>scatter</w:t>
+        <w:t>pandas</w:t>
       </w:r>
       <w:proofErr w:type="spellEnd"/>
       <w:r>
@@ -3096,296 +3109,52 @@
           <w:sz w:val="28"/>
           <w:szCs w:val="36"/>
         </w:rPr>
-        <w:t xml:space="preserve"> </w:t>
-      </w:r>
-      <w:proofErr w:type="spellStart"/>
-      <w:r>
+        <w:t>. Это позволило проводить анализ на основе всех доступных признаков.</w:t>
+      </w:r>
+    </w:p>
+    <w:p>
+      <w:pPr>
+        <w:pStyle w:val="1"/>
+        <w:numPr>
+          <w:ilvl w:val="0"/>
+          <w:numId w:val="12"/>
+        </w:numPr>
         <w:rPr>
           <w:sz w:val="28"/>
           <w:szCs w:val="36"/>
         </w:rPr>
-        <w:t>plot</w:t>
-      </w:r>
-      <w:proofErr w:type="spellEnd"/>
+      </w:pPr>
       <w:r>
         <w:rPr>
           <w:sz w:val="28"/>
           <w:szCs w:val="36"/>
         </w:rPr>
-        <w:t xml:space="preserve"> (точечный график), который отображает зависимость между стартовой позицией (</w:t>
-      </w:r>
-      <w:proofErr w:type="spellStart"/>
-      <w:r>
+        <w:t>Реализация программы:</w:t>
+      </w:r>
+    </w:p>
+    <w:p>
+      <w:pPr>
+        <w:pStyle w:val="1"/>
+        <w:numPr>
+          <w:ilvl w:val="1"/>
+          <w:numId w:val="12"/>
+        </w:numPr>
         <w:rPr>
           <w:sz w:val="28"/>
           <w:szCs w:val="36"/>
         </w:rPr>
-        <w:t>grid</w:t>
-      </w:r>
-      <w:proofErr w:type="spellEnd"/>
-      <w:r>
+      </w:pPr>
+      <w:r>
+        <w:t>Программа реализована в виде консольного Python-скрипта (Lab1/Lab1/Lab1.py). Скрипт подключается к SQLite, объединяет таблицы в один DataFrame, строит гистограммы и многомерный график, а также сохраняет изображения в папку Lab1/Lab1/plots/.</w:t>
+      </w:r>
+    </w:p>
+    <w:p>
+      <w:pPr>
+        <w:pStyle w:val="1"/>
         <w:rPr>
           <w:sz w:val="28"/>
           <w:szCs w:val="36"/>
         </w:rPr>
-        <w:t>) и финишной позицией (</w:t>
-      </w:r>
-      <w:proofErr w:type="spellStart"/>
-      <w:r>
-        <w:rPr>
-          <w:sz w:val="28"/>
-          <w:szCs w:val="36"/>
-        </w:rPr>
-        <w:t>position</w:t>
-      </w:r>
-      <w:proofErr w:type="spellEnd"/>
-      <w:r>
-        <w:rPr>
-          <w:sz w:val="28"/>
-          <w:szCs w:val="36"/>
-        </w:rPr>
-        <w:t>), а также количеством набранных очков (</w:t>
-      </w:r>
-      <w:proofErr w:type="spellStart"/>
-      <w:r>
-        <w:rPr>
-          <w:sz w:val="28"/>
-          <w:szCs w:val="36"/>
-        </w:rPr>
-        <w:t>points</w:t>
-      </w:r>
-      <w:proofErr w:type="spellEnd"/>
-      <w:r>
-        <w:rPr>
-          <w:sz w:val="28"/>
-          <w:szCs w:val="36"/>
-        </w:rPr>
-        <w:t>).</w:t>
-      </w:r>
-    </w:p>
-    <w:p>
-      <w:pPr>
-        <w:pStyle w:val="1"/>
-        <w:numPr>
-          <w:ilvl w:val="1"/>
-          <w:numId w:val="12"/>
-        </w:numPr>
-        <w:rPr>
-          <w:sz w:val="28"/>
-          <w:szCs w:val="36"/>
-        </w:rPr>
-      </w:pPr>
-      <w:r>
-        <w:rPr>
-          <w:sz w:val="28"/>
-          <w:szCs w:val="36"/>
-        </w:rPr>
-        <w:t xml:space="preserve">Также был построен </w:t>
-      </w:r>
-      <w:proofErr w:type="spellStart"/>
-      <w:r>
-        <w:rPr>
-          <w:sz w:val="28"/>
-          <w:szCs w:val="36"/>
-        </w:rPr>
-        <w:t>box</w:t>
-      </w:r>
-      <w:proofErr w:type="spellEnd"/>
-      <w:r>
-        <w:rPr>
-          <w:sz w:val="28"/>
-          <w:szCs w:val="36"/>
-        </w:rPr>
-        <w:t xml:space="preserve"> </w:t>
-      </w:r>
-      <w:proofErr w:type="spellStart"/>
-      <w:r>
-        <w:rPr>
-          <w:sz w:val="28"/>
-          <w:szCs w:val="36"/>
-        </w:rPr>
-        <w:t>plot</w:t>
-      </w:r>
-      <w:proofErr w:type="spellEnd"/>
-      <w:r>
-        <w:rPr>
-          <w:sz w:val="28"/>
-          <w:szCs w:val="36"/>
-        </w:rPr>
-        <w:t xml:space="preserve"> (ящик с усами) для анализа распределения очков в зависимости от национальности гонщика (</w:t>
-      </w:r>
-      <w:proofErr w:type="spellStart"/>
-      <w:r>
-        <w:rPr>
-          <w:sz w:val="28"/>
-          <w:szCs w:val="36"/>
-        </w:rPr>
-        <w:t>nationality</w:t>
-      </w:r>
-      <w:proofErr w:type="spellEnd"/>
-      <w:r>
-        <w:rPr>
-          <w:sz w:val="28"/>
-          <w:szCs w:val="36"/>
-        </w:rPr>
-        <w:t>). Это позволило выявить, что гонщики из некоторых стран в среднем набирают больше очков, чем другие.</w:t>
-      </w:r>
-    </w:p>
-    <w:p>
-      <w:pPr>
-        <w:pStyle w:val="1"/>
-        <w:numPr>
-          <w:ilvl w:val="1"/>
-          <w:numId w:val="12"/>
-        </w:numPr>
-        <w:rPr>
-          <w:sz w:val="28"/>
-          <w:szCs w:val="36"/>
-        </w:rPr>
-      </w:pPr>
-      <w:r>
-        <w:rPr>
-          <w:sz w:val="28"/>
-          <w:szCs w:val="36"/>
-        </w:rPr>
-        <w:t>На графиках видно, что стартовая позиция имеет значительное влияние на финишную позицию и количество набранных очков, что подтверждает важность квалификации в гонках Формулы 1.</w:t>
-      </w:r>
-    </w:p>
-    <w:p>
-      <w:pPr>
-        <w:pStyle w:val="1"/>
-        <w:numPr>
-          <w:ilvl w:val="0"/>
-          <w:numId w:val="12"/>
-        </w:numPr>
-        <w:rPr>
-          <w:sz w:val="28"/>
-          <w:szCs w:val="36"/>
-        </w:rPr>
-      </w:pPr>
-      <w:r>
-        <w:rPr>
-          <w:sz w:val="28"/>
-          <w:szCs w:val="36"/>
-        </w:rPr>
-        <w:t>Объединение данных в одну таблицу:</w:t>
-      </w:r>
-    </w:p>
-    <w:p>
-      <w:pPr>
-        <w:pStyle w:val="1"/>
-        <w:numPr>
-          <w:ilvl w:val="1"/>
-          <w:numId w:val="12"/>
-        </w:numPr>
-        <w:rPr>
-          <w:sz w:val="28"/>
-          <w:szCs w:val="36"/>
-        </w:rPr>
-      </w:pPr>
-      <w:r>
-        <w:rPr>
-          <w:sz w:val="28"/>
-          <w:szCs w:val="36"/>
-        </w:rPr>
-        <w:t>Для удобства анализа данные из нескольких таблиц были объединены в одну таблицу с использованием библиотеки </w:t>
-      </w:r>
-      <w:proofErr w:type="spellStart"/>
-      <w:r>
-        <w:rPr>
-          <w:sz w:val="28"/>
-          <w:szCs w:val="36"/>
-        </w:rPr>
-        <w:t>pandas</w:t>
-      </w:r>
-      <w:proofErr w:type="spellEnd"/>
-      <w:r>
-        <w:rPr>
-          <w:sz w:val="28"/>
-          <w:szCs w:val="36"/>
-        </w:rPr>
-        <w:t>. Это позволило проводить анализ на основе всех доступных признаков.</w:t>
-      </w:r>
-    </w:p>
-    <w:p>
-      <w:pPr>
-        <w:pStyle w:val="1"/>
-        <w:numPr>
-          <w:ilvl w:val="0"/>
-          <w:numId w:val="12"/>
-        </w:numPr>
-        <w:rPr>
-          <w:sz w:val="28"/>
-          <w:szCs w:val="36"/>
-        </w:rPr>
-      </w:pPr>
-      <w:r>
-        <w:rPr>
-          <w:sz w:val="28"/>
-          <w:szCs w:val="36"/>
-        </w:rPr>
-        <w:t>Реализация программы:</w:t>
-      </w:r>
-    </w:p>
-    <w:p>
-      <w:pPr>
-        <w:pStyle w:val="1"/>
-        <w:numPr>
-          <w:ilvl w:val="1"/>
-          <w:numId w:val="12"/>
-        </w:numPr>
-        <w:rPr>
-          <w:sz w:val="28"/>
-          <w:szCs w:val="36"/>
-        </w:rPr>
-      </w:pPr>
-      <w:r>
-        <w:rPr>
-          <w:sz w:val="28"/>
-          <w:szCs w:val="36"/>
-        </w:rPr>
-        <w:t xml:space="preserve">Программа реализована в виде </w:t>
-      </w:r>
-      <w:proofErr w:type="spellStart"/>
-      <w:r>
-        <w:rPr>
-          <w:sz w:val="28"/>
-          <w:szCs w:val="36"/>
-        </w:rPr>
-        <w:t>Jupyter</w:t>
-      </w:r>
-      <w:proofErr w:type="spellEnd"/>
-      <w:r>
-        <w:rPr>
-          <w:sz w:val="28"/>
-          <w:szCs w:val="36"/>
-        </w:rPr>
-        <w:t xml:space="preserve"> </w:t>
-      </w:r>
-      <w:proofErr w:type="spellStart"/>
-      <w:r>
-        <w:rPr>
-          <w:sz w:val="28"/>
-          <w:szCs w:val="36"/>
-        </w:rPr>
-        <w:t>Notebook</w:t>
-      </w:r>
-      <w:proofErr w:type="spellEnd"/>
-      <w:r>
-        <w:rPr>
-          <w:sz w:val="28"/>
-          <w:szCs w:val="36"/>
-        </w:rPr>
-        <w:t>, что позволяет интерактивно выполнять код и визуализировать результаты. Все этапы работы, включая загрузку данных, анализ и построение графиков, описаны в ноутбуке.</w:t>
-      </w:r>
-    </w:p>
-    <w:p>
-      <w:pPr>
-        <w:pStyle w:val="1"/>
-        <w:rPr>
-          <w:sz w:val="28"/>
-          <w:szCs w:val="36"/>
-        </w:rPr>
       </w:pPr>
     </w:p>
     <w:p>
@@ -3442,40 +3211,7 @@
         </w:numPr>
       </w:pPr>
       <w:r>
-        <w:lastRenderedPageBreak/>
-        <w:t xml:space="preserve">Проводить многомерный анализ данных, включая построение </w:t>
-      </w:r>
-      <w:proofErr w:type="spellStart"/>
-      <w:r>
-        <w:t>scatter</w:t>
-      </w:r>
-      <w:proofErr w:type="spellEnd"/>
-      <w:r>
-        <w:t xml:space="preserve"> </w:t>
-      </w:r>
-      <w:proofErr w:type="spellStart"/>
-      <w:r>
-        <w:t>plots</w:t>
-      </w:r>
-      <w:proofErr w:type="spellEnd"/>
-      <w:r>
-        <w:t xml:space="preserve"> и </w:t>
-      </w:r>
-      <w:proofErr w:type="spellStart"/>
-      <w:r>
-        <w:t>box</w:t>
-      </w:r>
-      <w:proofErr w:type="spellEnd"/>
-      <w:r>
-        <w:t xml:space="preserve"> </w:t>
-      </w:r>
-      <w:proofErr w:type="spellStart"/>
-      <w:r>
-        <w:t>plots</w:t>
-      </w:r>
-      <w:proofErr w:type="spellEnd"/>
-      <w:r>
-        <w:t xml:space="preserve"> для выявления взаимосвязей между признаками.</w:t>
+        <w:t>Проводить многомерный анализ данных, включая построение scatter-графика для выявления взаимосвязей между признаками.</w:t>
       </w:r>
     </w:p>
     <w:p>
@@ -3575,7 +3311,7 @@
         </w:numPr>
       </w:pPr>
       <w:r>
-        <w:t>Национальность гонщика также может влиять на его результаты, что подтверждается анализом распределения очков в зависимости от национальности.</w:t>
+        <w:t>Дополнительный анализ с учётом конструктора показывает, что у топовых команд чаще встречаются высокие очки.</w:t>
       </w:r>
     </w:p>
     <w:p>

</xml_diff>